<commit_message>
Reformat Word report to match course template (cover page + required sections)
</commit_message>
<xml_diff>
--- a/report/实验报告.docx
+++ b/report/实验报告.docx
@@ -4,233 +4,411 @@
   <w:body>
     <w:p>
       <w:pPr>
-        <w:pStyle w:val="Title"/>
+        <w:spacing w:before="0" w:after="0"/>
+      </w:pPr>
+    </w:p>
+    <w:p>
+      <w:pPr>
+        <w:spacing w:before="0" w:after="0"/>
+      </w:pPr>
+    </w:p>
+    <w:p>
+      <w:pPr>
+        <w:spacing w:before="0" w:after="0"/>
         <w:jc w:val="center"/>
       </w:pPr>
       <w:r>
-        <w:t>实验三 基于卷积神经网络的 MNIST 手写数字图片噪声处理</w:t>
-      </w:r>
-    </w:p>
-    <w:tbl>
-      <w:tblPr>
-        <w:tblStyle w:val="LightGrid-Accent1"/>
-        <w:tblW w:type="auto" w:w="0"/>
-        <w:jc w:val="center"/>
-        <w:tblLook w:firstColumn="1" w:firstRow="1" w:lastColumn="0" w:lastRow="0" w:noHBand="0" w:noVBand="1" w:val="04A0"/>
-      </w:tblPr>
-      <w:tblGrid>
-        <w:gridCol w:w="4320"/>
-        <w:gridCol w:w="4320"/>
-      </w:tblGrid>
-      <w:tr>
-        <w:tc>
-          <w:tcPr>
-            <w:tcW w:type="dxa" w:w="4320"/>
-          </w:tcPr>
-          <w:p>
-            <w:r>
-              <w:t>实验名称</w:t>
-            </w:r>
-          </w:p>
-        </w:tc>
-        <w:tc>
-          <w:tcPr>
-            <w:tcW w:type="dxa" w:w="4320"/>
-          </w:tcPr>
-          <w:p>
-            <w:r>
-              <w:t>基于卷积神经网络的 MNIST 手写数字图片噪声处理</w:t>
-            </w:r>
-          </w:p>
-        </w:tc>
-      </w:tr>
-      <w:tr>
-        <w:tc>
-          <w:tcPr>
-            <w:tcW w:type="dxa" w:w="4320"/>
-          </w:tcPr>
-          <w:p>
-            <w:r>
-              <w:t>专业班级</w:t>
-            </w:r>
-          </w:p>
-        </w:tc>
-        <w:tc>
-          <w:tcPr>
-            <w:tcW w:type="dxa" w:w="4320"/>
-          </w:tcPr>
-          <w:p>
-            <w:r>
-              <w:t>（请填写）</w:t>
-            </w:r>
-          </w:p>
-        </w:tc>
-      </w:tr>
-      <w:tr>
-        <w:tc>
-          <w:tcPr>
-            <w:tcW w:type="dxa" w:w="4320"/>
-          </w:tcPr>
-          <w:p>
-            <w:r>
-              <w:t>学号</w:t>
-            </w:r>
-          </w:p>
-        </w:tc>
-        <w:tc>
-          <w:tcPr>
-            <w:tcW w:type="dxa" w:w="4320"/>
-          </w:tcPr>
-          <w:p>
-            <w:r>
-              <w:t>（请填写）</w:t>
-            </w:r>
-          </w:p>
-        </w:tc>
-      </w:tr>
-      <w:tr>
-        <w:tc>
-          <w:tcPr>
-            <w:tcW w:type="dxa" w:w="4320"/>
-          </w:tcPr>
-          <w:p>
-            <w:r>
-              <w:t>姓名</w:t>
-            </w:r>
-          </w:p>
-        </w:tc>
-        <w:tc>
-          <w:tcPr>
-            <w:tcW w:type="dxa" w:w="4320"/>
-          </w:tcPr>
-          <w:p>
-            <w:r>
-              <w:t>（请填写）</w:t>
-            </w:r>
-          </w:p>
-        </w:tc>
-      </w:tr>
-      <w:tr>
-        <w:tc>
-          <w:tcPr>
-            <w:tcW w:type="dxa" w:w="4320"/>
-          </w:tcPr>
-          <w:p>
-            <w:r>
-              <w:t>实验日期</w:t>
-            </w:r>
-          </w:p>
-        </w:tc>
-        <w:tc>
-          <w:tcPr>
-            <w:tcW w:type="dxa" w:w="4320"/>
-          </w:tcPr>
-          <w:p>
-            <w:r>
-              <w:t>（请填写）</w:t>
-            </w:r>
-          </w:p>
-        </w:tc>
-      </w:tr>
-    </w:tbl>
-    <w:p>
-      <w:pPr>
-        <w:pStyle w:val="Heading1"/>
-      </w:pPr>
-      <w:r>
-        <w:t>一、实验目的</w:t>
+        <w:rPr>
+          <w:rFonts w:ascii="Times New Roman" w:hAnsi="Times New Roman" w:eastAsia="宋体"/>
+          <w:b/>
+          <w:sz w:val="44"/>
+        </w:rPr>
+        <w:t>人工智能技术及应用实验报告</w:t>
       </w:r>
     </w:p>
     <w:p>
       <w:pPr>
-        <w:pStyle w:val="ListNumber"/>
+        <w:spacing w:before="0" w:after="0"/>
+        <w:jc w:val="center"/>
       </w:pPr>
       <w:r>
-        <w:t>熟悉 PyTorch 深度学习框架的使用；</w:t>
+        <w:rPr>
+          <w:rFonts w:ascii="Times New Roman" w:hAnsi="Times New Roman" w:eastAsia="宋体"/>
+          <w:b w:val="0"/>
+          <w:sz w:val="32"/>
+        </w:rPr>
+        <w:t>（2026年）</w:t>
       </w:r>
     </w:p>
     <w:p>
       <w:pPr>
-        <w:pStyle w:val="ListNumber"/>
+        <w:spacing w:before="0" w:after="0"/>
+      </w:pPr>
+    </w:p>
+    <w:p>
+      <w:pPr>
+        <w:spacing w:before="0" w:after="0"/>
+      </w:pPr>
+    </w:p>
+    <w:p>
+      <w:pPr>
+        <w:spacing w:before="0" w:after="0"/>
+      </w:pPr>
+    </w:p>
+    <w:p>
+      <w:pPr>
+        <w:spacing w:before="0" w:after="0"/>
+      </w:pPr>
+    </w:p>
+    <w:p>
+      <w:pPr>
+        <w:spacing w:before="0" w:after="0"/>
+      </w:pPr>
+    </w:p>
+    <w:p>
+      <w:pPr>
+        <w:spacing w:before="0" w:after="240"/>
       </w:pPr>
       <w:r>
-        <w:t>熟悉卷积神经网络的训练思路；</w:t>
+        <w:rPr>
+          <w:rFonts w:ascii="Times New Roman" w:hAnsi="Times New Roman" w:eastAsia="宋体"/>
+          <w:b w:val="0"/>
+          <w:sz w:val="28"/>
+        </w:rPr>
+        <w:t>实 验 名 称 ： 基于卷积神经网络的 MNIST 手写数字图片噪声处理</w:t>
       </w:r>
     </w:p>
     <w:p>
       <w:pPr>
-        <w:pStyle w:val="ListNumber"/>
+        <w:spacing w:before="0" w:after="240"/>
       </w:pPr>
       <w:r>
-        <w:t>掌握卷积神经网络对图像噪声去除的过程。</w:t>
+        <w:rPr>
+          <w:rFonts w:ascii="Times New Roman" w:hAnsi="Times New Roman" w:eastAsia="宋体"/>
+          <w:b w:val="0"/>
+          <w:sz w:val="28"/>
+        </w:rPr>
+        <w:t xml:space="preserve">专 业 班 级 ：                                    </w:t>
       </w:r>
     </w:p>
     <w:p>
       <w:pPr>
-        <w:pStyle w:val="Heading1"/>
+        <w:spacing w:before="0" w:after="240"/>
       </w:pPr>
       <w:r>
-        <w:t>二、实验内容</w:t>
+        <w:rPr>
+          <w:rFonts w:ascii="Times New Roman" w:hAnsi="Times New Roman" w:eastAsia="宋体"/>
+          <w:b w:val="0"/>
+          <w:sz w:val="28"/>
+        </w:rPr>
+        <w:t xml:space="preserve">学 生 姓 名 ：                  学 生 学 号 ：                 </w:t>
       </w:r>
     </w:p>
     <w:p>
       <w:r>
+        <w:br w:type="page"/>
+      </w:r>
+    </w:p>
+    <w:p>
+      <w:pPr>
+        <w:spacing w:before="120" w:after="120"/>
+      </w:pPr>
+      <w:r>
+        <w:rPr>
+          <w:rFonts w:ascii="Times New Roman" w:hAnsi="Times New Roman" w:eastAsia="宋体"/>
+          <w:b/>
+          <w:sz w:val="28"/>
+        </w:rPr>
+        <w:t>1  实验目的</w:t>
+      </w:r>
+    </w:p>
+    <w:p>
+      <w:pPr>
+        <w:spacing w:before="0" w:after="0" w:line="360" w:lineRule="auto"/>
+        <w:ind w:firstLine="480"/>
+      </w:pPr>
+      <w:r>
+        <w:rPr>
+          <w:rFonts w:ascii="Times New Roman" w:hAnsi="Times New Roman" w:eastAsia="宋体"/>
+          <w:b w:val="0"/>
+          <w:sz w:val="24"/>
+        </w:rPr>
+        <w:t>（1）熟悉 PyTorch 深度学习框架的使用；</w:t>
+      </w:r>
+    </w:p>
+    <w:p>
+      <w:pPr>
+        <w:spacing w:before="0" w:after="0" w:line="360" w:lineRule="auto"/>
+        <w:ind w:firstLine="480"/>
+      </w:pPr>
+      <w:r>
+        <w:rPr>
+          <w:rFonts w:ascii="Times New Roman" w:hAnsi="Times New Roman" w:eastAsia="宋体"/>
+          <w:b w:val="0"/>
+          <w:sz w:val="24"/>
+        </w:rPr>
+        <w:t>（2）熟悉卷积神经网络的训练思路；</w:t>
+      </w:r>
+    </w:p>
+    <w:p>
+      <w:pPr>
+        <w:spacing w:before="0" w:after="0" w:line="360" w:lineRule="auto"/>
+        <w:ind w:firstLine="480"/>
+      </w:pPr>
+      <w:r>
+        <w:rPr>
+          <w:rFonts w:ascii="Times New Roman" w:hAnsi="Times New Roman" w:eastAsia="宋体"/>
+          <w:b w:val="0"/>
+          <w:sz w:val="24"/>
+        </w:rPr>
+        <w:t>（3）掌握卷积神经网络对图像噪声去除的过程。</w:t>
+      </w:r>
+    </w:p>
+    <w:p>
+      <w:pPr>
+        <w:spacing w:before="120" w:after="120"/>
+      </w:pPr>
+      <w:r>
+        <w:rPr>
+          <w:rFonts w:ascii="Times New Roman" w:hAnsi="Times New Roman" w:eastAsia="宋体"/>
+          <w:b/>
+          <w:sz w:val="28"/>
+        </w:rPr>
+        <w:t>2  实验内容</w:t>
+      </w:r>
+    </w:p>
+    <w:p>
+      <w:pPr>
+        <w:spacing w:before="0" w:after="0" w:line="360" w:lineRule="auto"/>
+        <w:ind w:firstLine="480"/>
+      </w:pPr>
+      <w:r>
+        <w:rPr>
+          <w:rFonts w:ascii="Times New Roman" w:hAnsi="Times New Roman" w:eastAsia="宋体"/>
+          <w:b w:val="0"/>
+          <w:sz w:val="24"/>
+        </w:rPr>
         <w:t>现实中的数字图像在数字化和传输过程中常受到成像设备或外部环境噪声干扰，减少图像中噪声的过程称为图像去噪。本实验以 MNIST 手写数字数据库为训练数据，搭建一个卷积去噪自编码器（Convolutional Denoising Autoencoder）模型实现图像去噪：在干净图像上叠加高斯噪声得到“加噪图像”作为网络输入，原始“干净图像”作为目标输出，让网络学习从加噪图像到干净图像的映射，从而去除噪声。</w:t>
       </w:r>
     </w:p>
     <w:p>
       <w:pPr>
-        <w:pStyle w:val="Heading1"/>
+        <w:spacing w:before="120" w:after="120"/>
       </w:pPr>
       <w:r>
-        <w:t>三、构建网络</w:t>
+        <w:rPr>
+          <w:rFonts w:ascii="Times New Roman" w:hAnsi="Times New Roman" w:eastAsia="宋体"/>
+          <w:b/>
+          <w:sz w:val="28"/>
+        </w:rPr>
+        <w:t>3  实验步骤</w:t>
       </w:r>
     </w:p>
     <w:p>
+      <w:pPr>
+        <w:spacing w:before="0" w:after="0" w:line="360" w:lineRule="auto"/>
+        <w:ind w:firstLine="480"/>
+      </w:pPr>
       <w:r>
-        <w:t>模型为对称的编码器—解码器结构。编码器用卷积 + 最大池化逐步下采样、提取特征并压缩到低维表示；解码器用转置卷积逐步上采样、重建去噪后的图像；最后用 Sigmoid 把输出限制到 [0, 1]。</w:t>
+        <w:rPr>
+          <w:rFonts w:ascii="Times New Roman" w:hAnsi="Times New Roman" w:eastAsia="宋体"/>
+          <w:b w:val="0"/>
+          <w:sz w:val="24"/>
+        </w:rPr>
+        <w:t>（1）读取数据（输入数据与目标输出数据）；</w:t>
       </w:r>
     </w:p>
     <w:p>
+      <w:pPr>
+        <w:spacing w:before="0" w:after="0" w:line="360" w:lineRule="auto"/>
+        <w:ind w:firstLine="480"/>
+      </w:pPr>
       <w:r>
-        <w:t>网络结构示意图：</w:t>
+        <w:rPr>
+          <w:rFonts w:ascii="Times New Roman" w:hAnsi="Times New Roman" w:eastAsia="宋体"/>
+          <w:b w:val="0"/>
+          <w:sz w:val="24"/>
+        </w:rPr>
+        <w:t>（2）创建卷积神经网络模型；</w:t>
       </w:r>
     </w:p>
     <w:p>
+      <w:pPr>
+        <w:spacing w:before="0" w:after="0" w:line="360" w:lineRule="auto"/>
+        <w:ind w:firstLine="480"/>
+      </w:pPr>
       <w:r>
         <w:rPr>
-          <w:rFonts w:ascii="Consolas" w:hAnsi="Consolas"/>
-          <w:sz w:val="18"/>
+          <w:rFonts w:ascii="Times New Roman" w:hAnsi="Times New Roman" w:eastAsia="宋体"/>
+          <w:b w:val="0"/>
+          <w:sz w:val="24"/>
         </w:rPr>
-        <w:t>输入 噪声图像 (1×28×28)</w:t>
-        <w:br/>
-        <w:t xml:space="preserve">  └─ 编码器 Encoder</w:t>
-        <w:br/>
-        <w:t xml:space="preserve">       Conv2d(1→32, 3×3, pad=1) + ReLU + MaxPool2d(2×2)  → 32×14×14</w:t>
-        <w:br/>
-        <w:t xml:space="preserve">       Conv2d(32→64, 3×3, pad=1) + ReLU + MaxPool2d(2×2) → 64×7×7  (瓶颈)</w:t>
-        <w:br/>
-        <w:t xml:space="preserve">  └─ 解码器 Decoder</w:t>
-        <w:br/>
-        <w:t xml:space="preserve">       ConvTranspose2d(64→32, 2×2, s=2) + ReLU            → 32×14×14</w:t>
-        <w:br/>
-        <w:t xml:space="preserve">       ConvTranspose2d(32→16, 2×2, s=2) + ReLU            → 16×28×28</w:t>
-        <w:br/>
-        <w:t xml:space="preserve">       Conv2d(16→1, 3×3, pad=1) + Sigmoid                 → 1×28×28</w:t>
-        <w:br/>
-        <w:t>输出 去噪图像 (1×28×28)</w:t>
+        <w:t>（3）训练网络；</w:t>
       </w:r>
     </w:p>
     <w:p>
+      <w:pPr>
+        <w:spacing w:before="0" w:after="0" w:line="360" w:lineRule="auto"/>
+        <w:ind w:firstLine="480"/>
+      </w:pPr>
       <w:r>
-        <w:t>网络各层输出尺寸：</w:t>
+        <w:rPr>
+          <w:rFonts w:ascii="Times New Roman" w:hAnsi="Times New Roman" w:eastAsia="宋体"/>
+          <w:b w:val="0"/>
+          <w:sz w:val="24"/>
+        </w:rPr>
+        <w:t>（4）测试网络；</w:t>
+      </w:r>
+    </w:p>
+    <w:p>
+      <w:pPr>
+        <w:spacing w:before="0" w:after="0" w:line="360" w:lineRule="auto"/>
+        <w:ind w:firstLine="480"/>
+      </w:pPr>
+      <w:r>
+        <w:rPr>
+          <w:rFonts w:ascii="Times New Roman" w:hAnsi="Times New Roman" w:eastAsia="宋体"/>
+          <w:b w:val="0"/>
+          <w:sz w:val="24"/>
+        </w:rPr>
+        <w:t>（5）结果输出与分析。</w:t>
+      </w:r>
+    </w:p>
+    <w:p>
+      <w:pPr>
+        <w:spacing w:before="120" w:after="120"/>
+      </w:pPr>
+      <w:r>
+        <w:rPr>
+          <w:rFonts w:ascii="Times New Roman" w:hAnsi="Times New Roman" w:eastAsia="宋体"/>
+          <w:b/>
+          <w:sz w:val="28"/>
+        </w:rPr>
+        <w:t>4  实验设备</w:t>
+      </w:r>
+    </w:p>
+    <w:p>
+      <w:pPr>
+        <w:spacing w:before="0" w:after="0" w:line="360" w:lineRule="auto"/>
+        <w:ind w:firstLine="480"/>
+      </w:pPr>
+      <w:r>
+        <w:rPr>
+          <w:rFonts w:ascii="Times New Roman" w:hAnsi="Times New Roman" w:eastAsia="宋体"/>
+          <w:b w:val="0"/>
+          <w:sz w:val="24"/>
+        </w:rPr>
+        <w:t>（1）计算机；</w:t>
+      </w:r>
+    </w:p>
+    <w:p>
+      <w:pPr>
+        <w:spacing w:before="0" w:after="0" w:line="360" w:lineRule="auto"/>
+        <w:ind w:firstLine="480"/>
+      </w:pPr>
+      <w:r>
+        <w:rPr>
+          <w:rFonts w:ascii="Times New Roman" w:hAnsi="Times New Roman" w:eastAsia="宋体"/>
+          <w:b w:val="0"/>
+          <w:sz w:val="24"/>
+        </w:rPr>
+        <w:t>（2）PyTorch 深度学习框架（torch 2.12，torchvision；运行设备：cpu）。</w:t>
+      </w:r>
+    </w:p>
+    <w:p>
+      <w:pPr>
+        <w:spacing w:before="120" w:after="120"/>
+      </w:pPr>
+      <w:r>
+        <w:rPr>
+          <w:rFonts w:ascii="Times New Roman" w:hAnsi="Times New Roman" w:eastAsia="宋体"/>
+          <w:b/>
+          <w:sz w:val="28"/>
+        </w:rPr>
+        <w:t>5  实验过程</w:t>
+      </w:r>
+    </w:p>
+    <w:p>
+      <w:pPr>
+        <w:spacing w:before="120" w:after="120"/>
+      </w:pPr>
+      <w:r>
+        <w:rPr>
+          <w:rFonts w:ascii="Times New Roman" w:hAnsi="Times New Roman" w:eastAsia="宋体"/>
+          <w:b/>
+          <w:sz w:val="24"/>
+        </w:rPr>
+        <w:t>5.1  数据读取与噪声添加</w:t>
+      </w:r>
+    </w:p>
+    <w:p>
+      <w:pPr>
+        <w:spacing w:before="0" w:after="0" w:line="360" w:lineRule="auto"/>
+        <w:ind w:firstLine="480"/>
+      </w:pPr>
+      <w:r>
+        <w:rPr>
+          <w:rFonts w:ascii="Times New Roman" w:hAnsi="Times New Roman" w:eastAsia="宋体"/>
+          <w:b w:val="0"/>
+          <w:sz w:val="24"/>
+        </w:rPr>
+        <w:t>使用 torchvision.datasets.MNIST 自动下载数据集（训练集 60000 张、测试集 10000 张，均为 28×28 单通道灰度图），并用 ToTensor() 将像素归一化到 [0, 1]。噪声采用零均值高斯噪声，叠加后裁剪回 [0, 1]：noisy = clamp(image + noise_factor × N(0,1), 0, 1)，其中 noise_factor = 0.5。训练时以干净图像为目标、加噪图像为输入。</w:t>
+      </w:r>
+    </w:p>
+    <w:p>
+      <w:pPr>
+        <w:spacing w:before="120" w:after="120"/>
+      </w:pPr>
+      <w:r>
+        <w:rPr>
+          <w:rFonts w:ascii="Times New Roman" w:hAnsi="Times New Roman" w:eastAsia="宋体"/>
+          <w:b/>
+          <w:sz w:val="24"/>
+        </w:rPr>
+        <w:t>5.2  卷积神经网络模型构建</w:t>
+      </w:r>
+    </w:p>
+    <w:p>
+      <w:pPr>
+        <w:spacing w:before="0" w:after="0" w:line="360" w:lineRule="auto"/>
+        <w:ind w:firstLine="480"/>
+      </w:pPr>
+      <w:r>
+        <w:rPr>
+          <w:rFonts w:ascii="Times New Roman" w:hAnsi="Times New Roman" w:eastAsia="宋体"/>
+          <w:b w:val="0"/>
+          <w:sz w:val="24"/>
+        </w:rPr>
+        <w:t>模型为对称的编码器—解码器结构。编码器用卷积 + 最大池化逐步下采样、提取特征并压缩到低维表示；解码器用转置卷积逐步上采样、重建去噪后的图像；最后用 Sigmoid 把输出限制到 [0, 1]。网络结构及各层输出尺寸如表1所示。</w:t>
+      </w:r>
+    </w:p>
+    <w:p>
+      <w:pPr>
+        <w:spacing w:before="120" w:after="0"/>
+        <w:jc w:val="center"/>
+      </w:pPr>
+      <w:r>
+        <w:rPr>
+          <w:rFonts w:ascii="Times New Roman" w:hAnsi="Times New Roman" w:eastAsia="宋体"/>
+          <w:b/>
+          <w:sz w:val="21"/>
+        </w:rPr>
+        <w:t>表1  卷积去噪自编码器网络结构</w:t>
       </w:r>
     </w:p>
     <w:tbl>
       <w:tblPr>
-        <w:tblStyle w:val="LightGrid-Accent1"/>
         <w:tblW w:type="auto" w:w="0"/>
+        <w:jc w:val="center"/>
         <w:tblLook w:firstColumn="1" w:firstRow="1" w:lastColumn="0" w:lastRow="0" w:noHBand="0" w:noVBand="1" w:val="04A0"/>
+        <w:tblBorders>
+          <w:top w:val="single" w:sz="12" w:space="0" w:color="000000"/>
+          <w:bottom w:val="single" w:sz="12" w:space="0" w:color="000000"/>
+          <w:left w:val="none" w:space="0" w:color="000000"/>
+          <w:right w:val="none" w:space="0" w:color="000000"/>
+          <w:insideH w:val="none" w:space="0" w:color="000000"/>
+          <w:insideV w:val="none" w:space="0" w:color="000000"/>
+        </w:tblBorders>
       </w:tblPr>
       <w:tblGrid>
         <w:gridCol w:w="2880"/>
@@ -241,9 +419,21 @@
         <w:tc>
           <w:tcPr>
             <w:tcW w:type="dxa" w:w="2880"/>
+            <w:tcBorders>
+              <w:bottom w:val="single" w:sz="6" w:space="0" w:color="000000"/>
+            </w:tcBorders>
           </w:tcPr>
           <w:p>
+            <w:pPr>
+              <w:jc w:val="center"/>
+            </w:pPr>
+            <w:r/>
             <w:r>
+              <w:rPr>
+                <w:rFonts w:ascii="Times New Roman" w:hAnsi="Times New Roman" w:eastAsia="宋体"/>
+                <w:b/>
+                <w:sz w:val="21"/>
+              </w:rPr>
               <w:t>层</w:t>
             </w:r>
           </w:p>
@@ -251,9 +441,21 @@
         <w:tc>
           <w:tcPr>
             <w:tcW w:type="dxa" w:w="2880"/>
+            <w:tcBorders>
+              <w:bottom w:val="single" w:sz="6" w:space="0" w:color="000000"/>
+            </w:tcBorders>
           </w:tcPr>
           <w:p>
+            <w:pPr>
+              <w:jc w:val="center"/>
+            </w:pPr>
+            <w:r/>
             <w:r>
+              <w:rPr>
+                <w:rFonts w:ascii="Times New Roman" w:hAnsi="Times New Roman" w:eastAsia="宋体"/>
+                <w:b/>
+                <w:sz w:val="21"/>
+              </w:rPr>
               <w:t>类型</w:t>
             </w:r>
           </w:p>
@@ -261,9 +463,21 @@
         <w:tc>
           <w:tcPr>
             <w:tcW w:type="dxa" w:w="2880"/>
+            <w:tcBorders>
+              <w:bottom w:val="single" w:sz="6" w:space="0" w:color="000000"/>
+            </w:tcBorders>
           </w:tcPr>
           <w:p>
+            <w:pPr>
+              <w:jc w:val="center"/>
+            </w:pPr>
+            <w:r/>
             <w:r>
+              <w:rPr>
+                <w:rFonts w:ascii="Times New Roman" w:hAnsi="Times New Roman" w:eastAsia="宋体"/>
+                <w:b/>
+                <w:sz w:val="21"/>
+              </w:rPr>
               <w:t>输出尺寸</w:t>
             </w:r>
           </w:p>
@@ -275,7 +489,16 @@
             <w:tcW w:type="dxa" w:w="2880"/>
           </w:tcPr>
           <w:p>
+            <w:pPr>
+              <w:jc w:val="center"/>
+            </w:pPr>
+            <w:r/>
             <w:r>
+              <w:rPr>
+                <w:rFonts w:ascii="Times New Roman" w:hAnsi="Times New Roman" w:eastAsia="宋体"/>
+                <w:b w:val="0"/>
+                <w:sz w:val="21"/>
+              </w:rPr>
               <w:t>输入</w:t>
             </w:r>
           </w:p>
@@ -285,7 +508,16 @@
             <w:tcW w:type="dxa" w:w="2880"/>
           </w:tcPr>
           <w:p>
+            <w:pPr>
+              <w:jc w:val="center"/>
+            </w:pPr>
+            <w:r/>
             <w:r>
+              <w:rPr>
+                <w:rFonts w:ascii="Times New Roman" w:hAnsi="Times New Roman" w:eastAsia="宋体"/>
+                <w:b w:val="0"/>
+                <w:sz w:val="21"/>
+              </w:rPr>
               <w:t>—</w:t>
             </w:r>
           </w:p>
@@ -295,7 +527,16 @@
             <w:tcW w:type="dxa" w:w="2880"/>
           </w:tcPr>
           <w:p>
+            <w:pPr>
+              <w:jc w:val="center"/>
+            </w:pPr>
+            <w:r/>
             <w:r>
+              <w:rPr>
+                <w:rFonts w:ascii="Times New Roman" w:hAnsi="Times New Roman" w:eastAsia="宋体"/>
+                <w:b w:val="0"/>
+                <w:sz w:val="21"/>
+              </w:rPr>
               <w:t>1 × 28 × 28</w:t>
             </w:r>
           </w:p>
@@ -307,7 +548,16 @@
             <w:tcW w:type="dxa" w:w="2880"/>
           </w:tcPr>
           <w:p>
+            <w:pPr>
+              <w:jc w:val="center"/>
+            </w:pPr>
+            <w:r/>
             <w:r>
+              <w:rPr>
+                <w:rFonts w:ascii="Times New Roman" w:hAnsi="Times New Roman" w:eastAsia="宋体"/>
+                <w:b w:val="0"/>
+                <w:sz w:val="21"/>
+              </w:rPr>
               <w:t>Conv1 + ReLU + MaxPool</w:t>
             </w:r>
           </w:p>
@@ -317,7 +567,16 @@
             <w:tcW w:type="dxa" w:w="2880"/>
           </w:tcPr>
           <w:p>
+            <w:pPr>
+              <w:jc w:val="center"/>
+            </w:pPr>
+            <w:r/>
             <w:r>
+              <w:rPr>
+                <w:rFonts w:ascii="Times New Roman" w:hAnsi="Times New Roman" w:eastAsia="宋体"/>
+                <w:b w:val="0"/>
+                <w:sz w:val="21"/>
+              </w:rPr>
               <w:t>卷积 + 池化</w:t>
             </w:r>
           </w:p>
@@ -327,7 +586,16 @@
             <w:tcW w:type="dxa" w:w="2880"/>
           </w:tcPr>
           <w:p>
+            <w:pPr>
+              <w:jc w:val="center"/>
+            </w:pPr>
+            <w:r/>
             <w:r>
+              <w:rPr>
+                <w:rFonts w:ascii="Times New Roman" w:hAnsi="Times New Roman" w:eastAsia="宋体"/>
+                <w:b w:val="0"/>
+                <w:sz w:val="21"/>
+              </w:rPr>
               <w:t>32 × 14 × 14</w:t>
             </w:r>
           </w:p>
@@ -339,7 +607,16 @@
             <w:tcW w:type="dxa" w:w="2880"/>
           </w:tcPr>
           <w:p>
+            <w:pPr>
+              <w:jc w:val="center"/>
+            </w:pPr>
+            <w:r/>
             <w:r>
+              <w:rPr>
+                <w:rFonts w:ascii="Times New Roman" w:hAnsi="Times New Roman" w:eastAsia="宋体"/>
+                <w:b w:val="0"/>
+                <w:sz w:val="21"/>
+              </w:rPr>
               <w:t>Conv2 + ReLU + MaxPool</w:t>
             </w:r>
           </w:p>
@@ -349,7 +626,16 @@
             <w:tcW w:type="dxa" w:w="2880"/>
           </w:tcPr>
           <w:p>
+            <w:pPr>
+              <w:jc w:val="center"/>
+            </w:pPr>
+            <w:r/>
             <w:r>
+              <w:rPr>
+                <w:rFonts w:ascii="Times New Roman" w:hAnsi="Times New Roman" w:eastAsia="宋体"/>
+                <w:b w:val="0"/>
+                <w:sz w:val="21"/>
+              </w:rPr>
               <w:t>卷积 + 池化</w:t>
             </w:r>
           </w:p>
@@ -359,7 +645,16 @@
             <w:tcW w:type="dxa" w:w="2880"/>
           </w:tcPr>
           <w:p>
+            <w:pPr>
+              <w:jc w:val="center"/>
+            </w:pPr>
+            <w:r/>
             <w:r>
+              <w:rPr>
+                <w:rFonts w:ascii="Times New Roman" w:hAnsi="Times New Roman" w:eastAsia="宋体"/>
+                <w:b w:val="0"/>
+                <w:sz w:val="21"/>
+              </w:rPr>
               <w:t>64 × 7 × 7</w:t>
             </w:r>
           </w:p>
@@ -371,7 +666,16 @@
             <w:tcW w:type="dxa" w:w="2880"/>
           </w:tcPr>
           <w:p>
+            <w:pPr>
+              <w:jc w:val="center"/>
+            </w:pPr>
+            <w:r/>
             <w:r>
+              <w:rPr>
+                <w:rFonts w:ascii="Times New Roman" w:hAnsi="Times New Roman" w:eastAsia="宋体"/>
+                <w:b w:val="0"/>
+                <w:sz w:val="21"/>
+              </w:rPr>
               <w:t>DeConv1 + ReLU</w:t>
             </w:r>
           </w:p>
@@ -381,7 +685,16 @@
             <w:tcW w:type="dxa" w:w="2880"/>
           </w:tcPr>
           <w:p>
+            <w:pPr>
+              <w:jc w:val="center"/>
+            </w:pPr>
+            <w:r/>
             <w:r>
+              <w:rPr>
+                <w:rFonts w:ascii="Times New Roman" w:hAnsi="Times New Roman" w:eastAsia="宋体"/>
+                <w:b w:val="0"/>
+                <w:sz w:val="21"/>
+              </w:rPr>
               <w:t>转置卷积</w:t>
             </w:r>
           </w:p>
@@ -391,7 +704,16 @@
             <w:tcW w:type="dxa" w:w="2880"/>
           </w:tcPr>
           <w:p>
+            <w:pPr>
+              <w:jc w:val="center"/>
+            </w:pPr>
+            <w:r/>
             <w:r>
+              <w:rPr>
+                <w:rFonts w:ascii="Times New Roman" w:hAnsi="Times New Roman" w:eastAsia="宋体"/>
+                <w:b w:val="0"/>
+                <w:sz w:val="21"/>
+              </w:rPr>
               <w:t>32 × 14 × 14</w:t>
             </w:r>
           </w:p>
@@ -403,7 +725,16 @@
             <w:tcW w:type="dxa" w:w="2880"/>
           </w:tcPr>
           <w:p>
+            <w:pPr>
+              <w:jc w:val="center"/>
+            </w:pPr>
+            <w:r/>
             <w:r>
+              <w:rPr>
+                <w:rFonts w:ascii="Times New Roman" w:hAnsi="Times New Roman" w:eastAsia="宋体"/>
+                <w:b w:val="0"/>
+                <w:sz w:val="21"/>
+              </w:rPr>
               <w:t>DeConv2 + ReLU</w:t>
             </w:r>
           </w:p>
@@ -413,7 +744,16 @@
             <w:tcW w:type="dxa" w:w="2880"/>
           </w:tcPr>
           <w:p>
+            <w:pPr>
+              <w:jc w:val="center"/>
+            </w:pPr>
+            <w:r/>
             <w:r>
+              <w:rPr>
+                <w:rFonts w:ascii="Times New Roman" w:hAnsi="Times New Roman" w:eastAsia="宋体"/>
+                <w:b w:val="0"/>
+                <w:sz w:val="21"/>
+              </w:rPr>
               <w:t>转置卷积</w:t>
             </w:r>
           </w:p>
@@ -423,7 +763,16 @@
             <w:tcW w:type="dxa" w:w="2880"/>
           </w:tcPr>
           <w:p>
+            <w:pPr>
+              <w:jc w:val="center"/>
+            </w:pPr>
+            <w:r/>
             <w:r>
+              <w:rPr>
+                <w:rFonts w:ascii="Times New Roman" w:hAnsi="Times New Roman" w:eastAsia="宋体"/>
+                <w:b w:val="0"/>
+                <w:sz w:val="21"/>
+              </w:rPr>
               <w:t>16 × 28 × 28</w:t>
             </w:r>
           </w:p>
@@ -435,7 +784,16 @@
             <w:tcW w:type="dxa" w:w="2880"/>
           </w:tcPr>
           <w:p>
+            <w:pPr>
+              <w:jc w:val="center"/>
+            </w:pPr>
+            <w:r/>
             <w:r>
+              <w:rPr>
+                <w:rFonts w:ascii="Times New Roman" w:hAnsi="Times New Roman" w:eastAsia="宋体"/>
+                <w:b w:val="0"/>
+                <w:sz w:val="21"/>
+              </w:rPr>
               <w:t>Conv3 + Sigmoid</w:t>
             </w:r>
           </w:p>
@@ -445,7 +803,16 @@
             <w:tcW w:type="dxa" w:w="2880"/>
           </w:tcPr>
           <w:p>
+            <w:pPr>
+              <w:jc w:val="center"/>
+            </w:pPr>
+            <w:r/>
             <w:r>
+              <w:rPr>
+                <w:rFonts w:ascii="Times New Roman" w:hAnsi="Times New Roman" w:eastAsia="宋体"/>
+                <w:b w:val="0"/>
+                <w:sz w:val="21"/>
+              </w:rPr>
               <w:t>卷积</w:t>
             </w:r>
           </w:p>
@@ -455,7 +822,16 @@
             <w:tcW w:type="dxa" w:w="2880"/>
           </w:tcPr>
           <w:p>
+            <w:pPr>
+              <w:jc w:val="center"/>
+            </w:pPr>
+            <w:r/>
             <w:r>
+              <w:rPr>
+                <w:rFonts w:ascii="Times New Roman" w:hAnsi="Times New Roman" w:eastAsia="宋体"/>
+                <w:b w:val="0"/>
+                <w:sz w:val="21"/>
+              </w:rPr>
               <w:t>1 × 28 × 28</w:t>
             </w:r>
           </w:p>
@@ -463,24 +839,73 @@
       </w:tr>
     </w:tbl>
     <w:p>
+      <w:pPr>
+        <w:spacing w:before="0" w:after="0" w:line="360" w:lineRule="auto"/>
+        <w:ind w:firstLine="480"/>
+      </w:pPr>
       <w:r>
-        <w:t>模型可训练参数量：29,249</w:t>
+        <w:rPr>
+          <w:rFonts w:ascii="Times New Roman" w:hAnsi="Times New Roman" w:eastAsia="宋体"/>
+          <w:b w:val="0"/>
+          <w:sz w:val="24"/>
+        </w:rPr>
+        <w:t>模型可训练参数量为 29,249 个。</w:t>
       </w:r>
     </w:p>
     <w:p>
       <w:pPr>
-        <w:pStyle w:val="Heading1"/>
+        <w:spacing w:before="120" w:after="120"/>
       </w:pPr>
       <w:r>
-        <w:t>四、神经网络参数设置</w:t>
+        <w:rPr>
+          <w:rFonts w:ascii="Times New Roman" w:hAnsi="Times New Roman" w:eastAsia="宋体"/>
+          <w:b/>
+          <w:sz w:val="24"/>
+        </w:rPr>
+        <w:t>5.3  网络参数设置</w:t>
+      </w:r>
+    </w:p>
+    <w:p>
+      <w:pPr>
+        <w:spacing w:before="0" w:after="0" w:line="360" w:lineRule="auto"/>
+        <w:ind w:firstLine="480"/>
+      </w:pPr>
+      <w:r>
+        <w:rPr>
+          <w:rFonts w:ascii="Times New Roman" w:hAnsi="Times New Roman" w:eastAsia="宋体"/>
+          <w:b w:val="0"/>
+          <w:sz w:val="24"/>
+        </w:rPr>
+        <w:t>训练采用 Adam 优化器与均方误差（MSE）损失函数，主要超参数如表2所示。</w:t>
+      </w:r>
+    </w:p>
+    <w:p>
+      <w:pPr>
+        <w:spacing w:before="120" w:after="0"/>
+        <w:jc w:val="center"/>
+      </w:pPr>
+      <w:r>
+        <w:rPr>
+          <w:rFonts w:ascii="Times New Roman" w:hAnsi="Times New Roman" w:eastAsia="宋体"/>
+          <w:b/>
+          <w:sz w:val="21"/>
+        </w:rPr>
+        <w:t>表2  神经网络参数设置</w:t>
       </w:r>
     </w:p>
     <w:tbl>
       <w:tblPr>
-        <w:tblStyle w:val="LightGrid-Accent1"/>
         <w:tblW w:type="auto" w:w="0"/>
         <w:jc w:val="center"/>
         <w:tblLook w:firstColumn="1" w:firstRow="1" w:lastColumn="0" w:lastRow="0" w:noHBand="0" w:noVBand="1" w:val="04A0"/>
+        <w:tblBorders>
+          <w:top w:val="single" w:sz="12" w:space="0" w:color="000000"/>
+          <w:bottom w:val="single" w:sz="12" w:space="0" w:color="000000"/>
+          <w:left w:val="none" w:space="0" w:color="000000"/>
+          <w:right w:val="none" w:space="0" w:color="000000"/>
+          <w:insideH w:val="none" w:space="0" w:color="000000"/>
+          <w:insideV w:val="none" w:space="0" w:color="000000"/>
+        </w:tblBorders>
       </w:tblPr>
       <w:tblGrid>
         <w:gridCol w:w="4320"/>
@@ -490,9 +915,64 @@
         <w:tc>
           <w:tcPr>
             <w:tcW w:type="dxa" w:w="4320"/>
+            <w:tcBorders>
+              <w:bottom w:val="single" w:sz="6" w:space="0" w:color="000000"/>
+            </w:tcBorders>
           </w:tcPr>
           <w:p>
+            <w:pPr>
+              <w:jc w:val="center"/>
+            </w:pPr>
+            <w:r/>
             <w:r>
+              <w:rPr>
+                <w:rFonts w:ascii="Times New Roman" w:hAnsi="Times New Roman" w:eastAsia="宋体"/>
+                <w:b/>
+                <w:sz w:val="21"/>
+              </w:rPr>
+              <w:t>参数</w:t>
+            </w:r>
+          </w:p>
+        </w:tc>
+        <w:tc>
+          <w:tcPr>
+            <w:tcW w:type="dxa" w:w="4320"/>
+            <w:tcBorders>
+              <w:bottom w:val="single" w:sz="6" w:space="0" w:color="000000"/>
+            </w:tcBorders>
+          </w:tcPr>
+          <w:p>
+            <w:pPr>
+              <w:jc w:val="center"/>
+            </w:pPr>
+            <w:r/>
+            <w:r>
+              <w:rPr>
+                <w:rFonts w:ascii="Times New Roman" w:hAnsi="Times New Roman" w:eastAsia="宋体"/>
+                <w:b/>
+                <w:sz w:val="21"/>
+              </w:rPr>
+              <w:t>取值</w:t>
+            </w:r>
+          </w:p>
+        </w:tc>
+      </w:tr>
+      <w:tr>
+        <w:tc>
+          <w:tcPr>
+            <w:tcW w:type="dxa" w:w="4320"/>
+          </w:tcPr>
+          <w:p>
+            <w:pPr>
+              <w:jc w:val="center"/>
+            </w:pPr>
+            <w:r/>
+            <w:r>
+              <w:rPr>
+                <w:rFonts w:ascii="Times New Roman" w:hAnsi="Times New Roman" w:eastAsia="宋体"/>
+                <w:b w:val="0"/>
+                <w:sz w:val="21"/>
+              </w:rPr>
               <w:t>迭代次数 (epochs)</w:t>
             </w:r>
           </w:p>
@@ -502,7 +982,16 @@
             <w:tcW w:type="dxa" w:w="4320"/>
           </w:tcPr>
           <w:p>
+            <w:pPr>
+              <w:jc w:val="center"/>
+            </w:pPr>
+            <w:r/>
             <w:r>
+              <w:rPr>
+                <w:rFonts w:ascii="Times New Roman" w:hAnsi="Times New Roman" w:eastAsia="宋体"/>
+                <w:b w:val="0"/>
+                <w:sz w:val="21"/>
+              </w:rPr>
               <w:t>15</w:t>
             </w:r>
           </w:p>
@@ -514,7 +1003,16 @@
             <w:tcW w:type="dxa" w:w="4320"/>
           </w:tcPr>
           <w:p>
+            <w:pPr>
+              <w:jc w:val="center"/>
+            </w:pPr>
+            <w:r/>
             <w:r>
+              <w:rPr>
+                <w:rFonts w:ascii="Times New Roman" w:hAnsi="Times New Roman" w:eastAsia="宋体"/>
+                <w:b w:val="0"/>
+                <w:sz w:val="21"/>
+              </w:rPr>
               <w:t>批大小 (batch size)</w:t>
             </w:r>
           </w:p>
@@ -524,7 +1022,16 @@
             <w:tcW w:type="dxa" w:w="4320"/>
           </w:tcPr>
           <w:p>
+            <w:pPr>
+              <w:jc w:val="center"/>
+            </w:pPr>
+            <w:r/>
             <w:r>
+              <w:rPr>
+                <w:rFonts w:ascii="Times New Roman" w:hAnsi="Times New Roman" w:eastAsia="宋体"/>
+                <w:b w:val="0"/>
+                <w:sz w:val="21"/>
+              </w:rPr>
               <w:t>128</w:t>
             </w:r>
           </w:p>
@@ -536,7 +1043,16 @@
             <w:tcW w:type="dxa" w:w="4320"/>
           </w:tcPr>
           <w:p>
+            <w:pPr>
+              <w:jc w:val="center"/>
+            </w:pPr>
+            <w:r/>
             <w:r>
+              <w:rPr>
+                <w:rFonts w:ascii="Times New Roman" w:hAnsi="Times New Roman" w:eastAsia="宋体"/>
+                <w:b w:val="0"/>
+                <w:sz w:val="21"/>
+              </w:rPr>
               <w:t>学习率 (learning rate)</w:t>
             </w:r>
           </w:p>
@@ -546,7 +1062,16 @@
             <w:tcW w:type="dxa" w:w="4320"/>
           </w:tcPr>
           <w:p>
+            <w:pPr>
+              <w:jc w:val="center"/>
+            </w:pPr>
+            <w:r/>
             <w:r>
+              <w:rPr>
+                <w:rFonts w:ascii="Times New Roman" w:hAnsi="Times New Roman" w:eastAsia="宋体"/>
+                <w:b w:val="0"/>
+                <w:sz w:val="21"/>
+              </w:rPr>
               <w:t>0.001</w:t>
             </w:r>
           </w:p>
@@ -558,7 +1083,16 @@
             <w:tcW w:type="dxa" w:w="4320"/>
           </w:tcPr>
           <w:p>
+            <w:pPr>
+              <w:jc w:val="center"/>
+            </w:pPr>
+            <w:r/>
             <w:r>
+              <w:rPr>
+                <w:rFonts w:ascii="Times New Roman" w:hAnsi="Times New Roman" w:eastAsia="宋体"/>
+                <w:b w:val="0"/>
+                <w:sz w:val="21"/>
+              </w:rPr>
               <w:t>优化器 (optimizer)</w:t>
             </w:r>
           </w:p>
@@ -568,7 +1102,16 @@
             <w:tcW w:type="dxa" w:w="4320"/>
           </w:tcPr>
           <w:p>
+            <w:pPr>
+              <w:jc w:val="center"/>
+            </w:pPr>
+            <w:r/>
             <w:r>
+              <w:rPr>
+                <w:rFonts w:ascii="Times New Roman" w:hAnsi="Times New Roman" w:eastAsia="宋体"/>
+                <w:b w:val="0"/>
+                <w:sz w:val="21"/>
+              </w:rPr>
               <w:t>Adam</w:t>
             </w:r>
           </w:p>
@@ -580,7 +1123,16 @@
             <w:tcW w:type="dxa" w:w="4320"/>
           </w:tcPr>
           <w:p>
+            <w:pPr>
+              <w:jc w:val="center"/>
+            </w:pPr>
+            <w:r/>
             <w:r>
+              <w:rPr>
+                <w:rFonts w:ascii="Times New Roman" w:hAnsi="Times New Roman" w:eastAsia="宋体"/>
+                <w:b w:val="0"/>
+                <w:sz w:val="21"/>
+              </w:rPr>
               <w:t>损失函数 (loss)</w:t>
             </w:r>
           </w:p>
@@ -590,7 +1142,16 @@
             <w:tcW w:type="dxa" w:w="4320"/>
           </w:tcPr>
           <w:p>
+            <w:pPr>
+              <w:jc w:val="center"/>
+            </w:pPr>
+            <w:r/>
             <w:r>
+              <w:rPr>
+                <w:rFonts w:ascii="Times New Roman" w:hAnsi="Times New Roman" w:eastAsia="宋体"/>
+                <w:b w:val="0"/>
+                <w:sz w:val="21"/>
+              </w:rPr>
               <w:t>MSELoss（均方误差）</w:t>
             </w:r>
           </w:p>
@@ -602,7 +1163,16 @@
             <w:tcW w:type="dxa" w:w="4320"/>
           </w:tcPr>
           <w:p>
+            <w:pPr>
+              <w:jc w:val="center"/>
+            </w:pPr>
+            <w:r/>
             <w:r>
+              <w:rPr>
+                <w:rFonts w:ascii="Times New Roman" w:hAnsi="Times New Roman" w:eastAsia="宋体"/>
+                <w:b w:val="0"/>
+                <w:sz w:val="21"/>
+              </w:rPr>
               <w:t>噪声类型 / 强度</w:t>
             </w:r>
           </w:p>
@@ -612,8 +1182,17 @@
             <w:tcW w:type="dxa" w:w="4320"/>
           </w:tcPr>
           <w:p>
+            <w:pPr>
+              <w:jc w:val="center"/>
+            </w:pPr>
+            <w:r/>
             <w:r>
-              <w:t>高斯噪声 / noise_factor = 0.5</w:t>
+              <w:rPr>
+                <w:rFonts w:ascii="Times New Roman" w:hAnsi="Times New Roman" w:eastAsia="宋体"/>
+                <w:b w:val="0"/>
+                <w:sz w:val="21"/>
+              </w:rPr>
+              <w:t>高斯噪声 / 0.5</w:t>
             </w:r>
           </w:p>
         </w:tc>
@@ -624,7 +1203,16 @@
             <w:tcW w:type="dxa" w:w="4320"/>
           </w:tcPr>
           <w:p>
+            <w:pPr>
+              <w:jc w:val="center"/>
+            </w:pPr>
+            <w:r/>
             <w:r>
+              <w:rPr>
+                <w:rFonts w:ascii="Times New Roman" w:hAnsi="Times New Roman" w:eastAsia="宋体"/>
+                <w:b w:val="0"/>
+                <w:sz w:val="21"/>
+              </w:rPr>
               <w:t>激活函数</w:t>
             </w:r>
           </w:p>
@@ -634,7 +1222,16 @@
             <w:tcW w:type="dxa" w:w="4320"/>
           </w:tcPr>
           <w:p>
+            <w:pPr>
+              <w:jc w:val="center"/>
+            </w:pPr>
+            <w:r/>
             <w:r>
+              <w:rPr>
+                <w:rFonts w:ascii="Times New Roman" w:hAnsi="Times New Roman" w:eastAsia="宋体"/>
+                <w:b w:val="0"/>
+                <w:sz w:val="21"/>
+              </w:rPr>
               <w:t>ReLU（隐藏层）、Sigmoid（输出层）</w:t>
             </w:r>
           </w:p>
@@ -646,8 +1243,17 @@
             <w:tcW w:type="dxa" w:w="4320"/>
           </w:tcPr>
           <w:p>
+            <w:pPr>
+              <w:jc w:val="center"/>
+            </w:pPr>
+            <w:r/>
             <w:r>
-              <w:t>设备</w:t>
+              <w:rPr>
+                <w:rFonts w:ascii="Times New Roman" w:hAnsi="Times New Roman" w:eastAsia="宋体"/>
+                <w:b w:val="0"/>
+                <w:sz w:val="21"/>
+              </w:rPr>
+              <w:t>运行设备</w:t>
             </w:r>
           </w:p>
         </w:tc>
@@ -656,7 +1262,16 @@
             <w:tcW w:type="dxa" w:w="4320"/>
           </w:tcPr>
           <w:p>
+            <w:pPr>
+              <w:jc w:val="center"/>
+            </w:pPr>
+            <w:r/>
             <w:r>
+              <w:rPr>
+                <w:rFonts w:ascii="Times New Roman" w:hAnsi="Times New Roman" w:eastAsia="宋体"/>
+                <w:b w:val="0"/>
+                <w:sz w:val="21"/>
+              </w:rPr>
               <w:t>cpu</w:t>
             </w:r>
           </w:p>
@@ -664,29 +1279,30 @@
       </w:tr>
     </w:tbl>
     <w:p>
+      <w:pPr>
+        <w:spacing w:before="120" w:after="120"/>
+      </w:pPr>
       <w:r>
-        <w:t>启动命令： python src/main.py --epochs 15 --batch-size 128 --lr 0.001 --noise-factor 0.5</w:t>
+        <w:rPr>
+          <w:rFonts w:ascii="Times New Roman" w:hAnsi="Times New Roman" w:eastAsia="宋体"/>
+          <w:b/>
+          <w:sz w:val="24"/>
+        </w:rPr>
+        <w:t>5.4  训练过程</w:t>
       </w:r>
     </w:p>
     <w:p>
       <w:pPr>
-        <w:pStyle w:val="Heading1"/>
+        <w:spacing w:before="0" w:after="0" w:line="360" w:lineRule="auto"/>
+        <w:ind w:firstLine="480"/>
       </w:pPr>
       <w:r>
-        <w:t>五、实验结果与分析</w:t>
-      </w:r>
-    </w:p>
-    <w:p>
-      <w:pPr>
-        <w:pStyle w:val="Heading2"/>
-      </w:pPr>
-      <w:r>
-        <w:t>5.1 训练损失曲线</w:t>
-      </w:r>
-    </w:p>
-    <w:p>
-      <w:r>
-        <w:t>随着迭代轮数增加，训练 MSE 损失从约 0.0527 快速下降并逐渐收敛到约 0.0123，说明网络有效地学习到了去噪映射。</w:t>
+        <w:rPr>
+          <w:rFonts w:ascii="Times New Roman" w:hAnsi="Times New Roman" w:eastAsia="宋体"/>
+          <w:b w:val="0"/>
+          <w:sz w:val="24"/>
+        </w:rPr>
+        <w:t>每个批次取干净图像并在线生成加噪图像，前向得到去噪输出，计算其与干净图像之间的 MSE，再反向传播更新参数。训练损失随迭代轮数的变化如图1所示：损失从约 0.0527 快速下降并逐渐收敛到约 0.0123，说明网络有效地学习到了去噪映射。</w:t>
       </w:r>
     </w:p>
     <w:p>
@@ -696,7 +1312,7 @@
       <w:r>
         <w:drawing>
           <wp:inline xmlns:a="http://schemas.openxmlformats.org/drawingml/2006/main" xmlns:pic="http://schemas.openxmlformats.org/drawingml/2006/picture">
-            <wp:extent cx="4754880" cy="3169920"/>
+            <wp:extent cx="4572000" cy="3048000"/>
             <wp:docPr id="1" name="Picture 1"/>
             <wp:cNvGraphicFramePr>
               <a:graphicFrameLocks noChangeAspect="1"/>
@@ -717,7 +1333,7 @@
                   <pic:spPr>
                     <a:xfrm>
                       <a:off x="0" y="0"/>
-                      <a:ext cx="4754880" cy="3169920"/>
+                      <a:ext cx="4572000" cy="3048000"/>
                     </a:xfrm>
                     <a:prstGeom prst="rect"/>
                   </pic:spPr>
@@ -730,15 +1346,43 @@
     </w:p>
     <w:p>
       <w:pPr>
-        <w:pStyle w:val="Heading2"/>
+        <w:spacing w:before="0" w:after="120"/>
+        <w:jc w:val="center"/>
       </w:pPr>
       <w:r>
-        <w:t>5.2 去噪效果对比（干净 / 加噪 / 去噪）</w:t>
+        <w:rPr>
+          <w:rFonts w:ascii="Times New Roman" w:hAnsi="Times New Roman" w:eastAsia="宋体"/>
+          <w:b/>
+          <w:sz w:val="21"/>
+        </w:rPr>
+        <w:t>图1  训练损失曲线</w:t>
       </w:r>
     </w:p>
     <w:p>
+      <w:pPr>
+        <w:spacing w:before="120" w:after="120"/>
+      </w:pPr>
       <w:r>
-        <w:t>第一行为干净目标图像，第二行为加入高斯噪声后的输入图像（噪声很强、数字几乎被淹没），第三行为网络去噪后的输出。可见网络成功去除了绝大部分噪声并较好地恢复了数字笔画。</w:t>
+        <w:rPr>
+          <w:rFonts w:ascii="Times New Roman" w:hAnsi="Times New Roman" w:eastAsia="宋体"/>
+          <w:b/>
+          <w:sz w:val="24"/>
+        </w:rPr>
+        <w:t>5.5  测试结果</w:t>
+      </w:r>
+    </w:p>
+    <w:p>
+      <w:pPr>
+        <w:spacing w:before="0" w:after="0" w:line="360" w:lineRule="auto"/>
+        <w:ind w:firstLine="480"/>
+      </w:pPr>
+      <w:r>
+        <w:rPr>
+          <w:rFonts w:ascii="Times New Roman" w:hAnsi="Times New Roman" w:eastAsia="宋体"/>
+          <w:b w:val="0"/>
+          <w:sz w:val="24"/>
+        </w:rPr>
+        <w:t>在测试集（10000 张）上对网络进行测试。去噪效果对比如图2所示：第一行为干净目标图像，第二行为加入高斯噪声后的输入图像（噪声很强、数字几乎被淹没），第三行为网络去噪后的输出，可见网络成功去除了绝大部分噪声并较好地恢复了数字笔画。</w:t>
       </w:r>
     </w:p>
     <w:p>
@@ -748,7 +1392,7 @@
       <w:r>
         <w:drawing>
           <wp:inline xmlns:a="http://schemas.openxmlformats.org/drawingml/2006/main" xmlns:pic="http://schemas.openxmlformats.org/drawingml/2006/picture">
-            <wp:extent cx="5669280" cy="2328454"/>
+            <wp:extent cx="5486400" cy="2253343"/>
             <wp:docPr id="2" name="Picture 2"/>
             <wp:cNvGraphicFramePr>
               <a:graphicFrameLocks noChangeAspect="1"/>
@@ -769,7 +1413,7 @@
                   <pic:spPr>
                     <a:xfrm>
                       <a:off x="0" y="0"/>
-                      <a:ext cx="5669280" cy="2328454"/>
+                      <a:ext cx="5486400" cy="2253343"/>
                     </a:xfrm>
                     <a:prstGeom prst="rect"/>
                   </pic:spPr>
@@ -782,22 +1426,59 @@
     </w:p>
     <w:p>
       <w:pPr>
-        <w:pStyle w:val="Heading2"/>
+        <w:spacing w:before="0" w:after="120"/>
+        <w:jc w:val="center"/>
       </w:pPr>
       <w:r>
-        <w:t>5.3 测试精度（量化指标）</w:t>
+        <w:rPr>
+          <w:rFonts w:ascii="Times New Roman" w:hAnsi="Times New Roman" w:eastAsia="宋体"/>
+          <w:b/>
+          <w:sz w:val="21"/>
+        </w:rPr>
+        <w:t>图2  去噪效果对比（干净 / 加噪 / 去噪）</w:t>
       </w:r>
     </w:p>
     <w:p>
+      <w:pPr>
+        <w:spacing w:before="0" w:after="0" w:line="360" w:lineRule="auto"/>
+        <w:ind w:firstLine="480"/>
+      </w:pPr>
       <w:r>
-        <w:t>对于图像去噪任务，“模型精度”用重建图像与干净图像的接近程度衡量，即 PSNR / SSIM / MSE。下表为测试集（10000 张）上的结果：</w:t>
+        <w:rPr>
+          <w:rFonts w:ascii="Times New Roman" w:hAnsi="Times New Roman" w:eastAsia="宋体"/>
+          <w:b w:val="0"/>
+          <w:sz w:val="24"/>
+        </w:rPr>
+        <w:t>对于图像去噪任务，“模型精度”用重建图像与干净图像的接近程度衡量，即 PSNR / SSIM / MSE，测试集量化结果如表3所示。</w:t>
+      </w:r>
+    </w:p>
+    <w:p>
+      <w:pPr>
+        <w:spacing w:before="120" w:after="0"/>
+        <w:jc w:val="center"/>
+      </w:pPr>
+      <w:r>
+        <w:rPr>
+          <w:rFonts w:ascii="Times New Roman" w:hAnsi="Times New Roman" w:eastAsia="宋体"/>
+          <w:b/>
+          <w:sz w:val="21"/>
+        </w:rPr>
+        <w:t>表3  测试集去噪精度</w:t>
       </w:r>
     </w:p>
     <w:tbl>
       <w:tblPr>
-        <w:tblStyle w:val="LightGrid-Accent1"/>
         <w:tblW w:type="auto" w:w="0"/>
+        <w:jc w:val="center"/>
         <w:tblLook w:firstColumn="1" w:firstRow="1" w:lastColumn="0" w:lastRow="0" w:noHBand="0" w:noVBand="1" w:val="04A0"/>
+        <w:tblBorders>
+          <w:top w:val="single" w:sz="12" w:space="0" w:color="000000"/>
+          <w:bottom w:val="single" w:sz="12" w:space="0" w:color="000000"/>
+          <w:left w:val="none" w:space="0" w:color="000000"/>
+          <w:right w:val="none" w:space="0" w:color="000000"/>
+          <w:insideH w:val="none" w:space="0" w:color="000000"/>
+          <w:insideV w:val="none" w:space="0" w:color="000000"/>
+        </w:tblBorders>
       </w:tblPr>
       <w:tblGrid>
         <w:gridCol w:w="2880"/>
@@ -808,9 +1489,21 @@
         <w:tc>
           <w:tcPr>
             <w:tcW w:type="dxa" w:w="2880"/>
+            <w:tcBorders>
+              <w:bottom w:val="single" w:sz="6" w:space="0" w:color="000000"/>
+            </w:tcBorders>
           </w:tcPr>
           <w:p>
+            <w:pPr>
+              <w:jc w:val="center"/>
+            </w:pPr>
+            <w:r/>
             <w:r>
+              <w:rPr>
+                <w:rFonts w:ascii="Times New Roman" w:hAnsi="Times New Roman" w:eastAsia="宋体"/>
+                <w:b/>
+                <w:sz w:val="21"/>
+              </w:rPr>
               <w:t>指标</w:t>
             </w:r>
           </w:p>
@@ -818,9 +1511,21 @@
         <w:tc>
           <w:tcPr>
             <w:tcW w:type="dxa" w:w="2880"/>
+            <w:tcBorders>
+              <w:bottom w:val="single" w:sz="6" w:space="0" w:color="000000"/>
+            </w:tcBorders>
           </w:tcPr>
           <w:p>
+            <w:pPr>
+              <w:jc w:val="center"/>
+            </w:pPr>
+            <w:r/>
             <w:r>
+              <w:rPr>
+                <w:rFonts w:ascii="Times New Roman" w:hAnsi="Times New Roman" w:eastAsia="宋体"/>
+                <w:b/>
+                <w:sz w:val="21"/>
+              </w:rPr>
               <w:t>加噪输入（基线）</w:t>
             </w:r>
           </w:p>
@@ -828,9 +1533,21 @@
         <w:tc>
           <w:tcPr>
             <w:tcW w:type="dxa" w:w="2880"/>
+            <w:tcBorders>
+              <w:bottom w:val="single" w:sz="6" w:space="0" w:color="000000"/>
+            </w:tcBorders>
           </w:tcPr>
           <w:p>
+            <w:pPr>
+              <w:jc w:val="center"/>
+            </w:pPr>
+            <w:r/>
             <w:r>
+              <w:rPr>
+                <w:rFonts w:ascii="Times New Roman" w:hAnsi="Times New Roman" w:eastAsia="宋体"/>
+                <w:b/>
+                <w:sz w:val="21"/>
+              </w:rPr>
               <w:t>去噪输出（本模型）</w:t>
             </w:r>
           </w:p>
@@ -842,7 +1559,16 @@
             <w:tcW w:type="dxa" w:w="2880"/>
           </w:tcPr>
           <w:p>
+            <w:pPr>
+              <w:jc w:val="center"/>
+            </w:pPr>
+            <w:r/>
             <w:r>
+              <w:rPr>
+                <w:rFonts w:ascii="Times New Roman" w:hAnsi="Times New Roman" w:eastAsia="宋体"/>
+                <w:b w:val="0"/>
+                <w:sz w:val="21"/>
+              </w:rPr>
               <w:t>PSNR</w:t>
             </w:r>
           </w:p>
@@ -852,7 +1578,16 @@
             <w:tcW w:type="dxa" w:w="2880"/>
           </w:tcPr>
           <w:p>
+            <w:pPr>
+              <w:jc w:val="center"/>
+            </w:pPr>
+            <w:r/>
             <w:r>
+              <w:rPr>
+                <w:rFonts w:ascii="Times New Roman" w:hAnsi="Times New Roman" w:eastAsia="宋体"/>
+                <w:b w:val="0"/>
+                <w:sz w:val="21"/>
+              </w:rPr>
               <w:t>9.38 dB</w:t>
             </w:r>
           </w:p>
@@ -862,7 +1597,16 @@
             <w:tcW w:type="dxa" w:w="2880"/>
           </w:tcPr>
           <w:p>
+            <w:pPr>
+              <w:jc w:val="center"/>
+            </w:pPr>
+            <w:r/>
             <w:r>
+              <w:rPr>
+                <w:rFonts w:ascii="Times New Roman" w:hAnsi="Times New Roman" w:eastAsia="宋体"/>
+                <w:b w:val="0"/>
+                <w:sz w:val="21"/>
+              </w:rPr>
               <w:t>19.48 dB</w:t>
             </w:r>
           </w:p>
@@ -874,7 +1618,16 @@
             <w:tcW w:type="dxa" w:w="2880"/>
           </w:tcPr>
           <w:p>
+            <w:pPr>
+              <w:jc w:val="center"/>
+            </w:pPr>
+            <w:r/>
             <w:r>
+              <w:rPr>
+                <w:rFonts w:ascii="Times New Roman" w:hAnsi="Times New Roman" w:eastAsia="宋体"/>
+                <w:b w:val="0"/>
+                <w:sz w:val="21"/>
+              </w:rPr>
               <w:t>SSIM</w:t>
             </w:r>
           </w:p>
@@ -884,7 +1637,16 @@
             <w:tcW w:type="dxa" w:w="2880"/>
           </w:tcPr>
           <w:p>
+            <w:pPr>
+              <w:jc w:val="center"/>
+            </w:pPr>
+            <w:r/>
             <w:r>
+              <w:rPr>
+                <w:rFonts w:ascii="Times New Roman" w:hAnsi="Times New Roman" w:eastAsia="宋体"/>
+                <w:b w:val="0"/>
+                <w:sz w:val="21"/>
+              </w:rPr>
               <w:t>—</w:t>
             </w:r>
           </w:p>
@@ -894,7 +1656,16 @@
             <w:tcW w:type="dxa" w:w="2880"/>
           </w:tcPr>
           <w:p>
+            <w:pPr>
+              <w:jc w:val="center"/>
+            </w:pPr>
+            <w:r/>
             <w:r>
+              <w:rPr>
+                <w:rFonts w:ascii="Times New Roman" w:hAnsi="Times New Roman" w:eastAsia="宋体"/>
+                <w:b w:val="0"/>
+                <w:sz w:val="21"/>
+              </w:rPr>
               <w:t>0.8313</w:t>
             </w:r>
           </w:p>
@@ -906,7 +1677,16 @@
             <w:tcW w:type="dxa" w:w="2880"/>
           </w:tcPr>
           <w:p>
+            <w:pPr>
+              <w:jc w:val="center"/>
+            </w:pPr>
+            <w:r/>
             <w:r>
+              <w:rPr>
+                <w:rFonts w:ascii="Times New Roman" w:hAnsi="Times New Roman" w:eastAsia="宋体"/>
+                <w:b w:val="0"/>
+                <w:sz w:val="21"/>
+              </w:rPr>
               <w:t>MSE</w:t>
             </w:r>
           </w:p>
@@ -916,7 +1696,16 @@
             <w:tcW w:type="dxa" w:w="2880"/>
           </w:tcPr>
           <w:p>
+            <w:pPr>
+              <w:jc w:val="center"/>
+            </w:pPr>
+            <w:r/>
             <w:r>
+              <w:rPr>
+                <w:rFonts w:ascii="Times New Roman" w:hAnsi="Times New Roman" w:eastAsia="宋体"/>
+                <w:b w:val="0"/>
+                <w:sz w:val="21"/>
+              </w:rPr>
               <w:t>—</w:t>
             </w:r>
           </w:p>
@@ -926,7 +1715,16 @@
             <w:tcW w:type="dxa" w:w="2880"/>
           </w:tcPr>
           <w:p>
+            <w:pPr>
+              <w:jc w:val="center"/>
+            </w:pPr>
+            <w:r/>
             <w:r>
+              <w:rPr>
+                <w:rFonts w:ascii="Times New Roman" w:hAnsi="Times New Roman" w:eastAsia="宋体"/>
+                <w:b w:val="0"/>
+                <w:sz w:val="21"/>
+              </w:rPr>
               <w:t>0.012092</w:t>
             </w:r>
           </w:p>
@@ -934,15 +1732,27 @@
       </w:tr>
     </w:tbl>
     <w:p>
+      <w:pPr>
+        <w:spacing w:before="0" w:after="0"/>
+      </w:pPr>
       <w:r>
+        <w:rPr>
+          <w:rFonts w:ascii="Times New Roman" w:hAnsi="Times New Roman" w:eastAsia="宋体"/>
+          <w:b w:val="0"/>
+          <w:sz w:val="24"/>
+        </w:rPr>
         <w:t>测试控制台输出（用于截图存档）：</w:t>
       </w:r>
     </w:p>
     <w:p>
+      <w:pPr>
+        <w:spacing w:before="0" w:after="0"/>
+      </w:pPr>
       <w:r>
         <w:rPr>
-          <w:rFonts w:ascii="Consolas" w:hAnsi="Consolas"/>
-          <w:sz w:val="18"/>
+          <w:rFonts w:ascii="Consolas" w:hAnsi="Consolas" w:eastAsia="宋体"/>
+          <w:b w:val="0"/>
+          <w:sz w:val="21"/>
         </w:rPr>
         <w:t>=== Test results ===</w:t>
         <w:br/>
@@ -957,54 +1767,97 @@
     </w:p>
     <w:p>
       <w:pPr>
-        <w:pStyle w:val="Heading2"/>
+        <w:spacing w:before="120" w:after="120"/>
       </w:pPr>
       <w:r>
-        <w:t>5.4 结果分析</w:t>
+        <w:rPr>
+          <w:rFonts w:ascii="Times New Roman" w:hAnsi="Times New Roman" w:eastAsia="宋体"/>
+          <w:b/>
+          <w:sz w:val="24"/>
+        </w:rPr>
+        <w:t>5.6  结果分析</w:t>
       </w:r>
     </w:p>
     <w:p>
       <w:pPr>
-        <w:pStyle w:val="ListBullet"/>
+        <w:spacing w:before="0" w:after="0" w:line="360" w:lineRule="auto"/>
+        <w:ind w:firstLine="480"/>
       </w:pPr>
       <w:r>
-        <w:t>去噪效果显著：PSNR 由加噪输入的 9.38 dB 提升到去噪输出的 19.48 dB，提升约 10.1 dB；SSIM 达到 0.83，表明去噪图像在结构上与原图高度相似。</w:t>
+        <w:rPr>
+          <w:rFonts w:ascii="Times New Roman" w:hAnsi="Times New Roman" w:eastAsia="宋体"/>
+          <w:b w:val="0"/>
+          <w:sz w:val="24"/>
+        </w:rPr>
+        <w:t>（1）去噪效果显著：PSNR 由加噪输入的 9.38 dB 提升到去噪输出的 19.48 dB，提升约 10.1 dB；SSIM 达到 0.83，表明去噪图像在结构上与原图高度相似。</w:t>
       </w:r>
     </w:p>
     <w:p>
       <w:pPr>
-        <w:pStyle w:val="ListBullet"/>
+        <w:spacing w:before="0" w:after="0" w:line="360" w:lineRule="auto"/>
+        <w:ind w:firstLine="480"/>
       </w:pPr>
       <w:r>
-        <w:t>收敛行为合理：损失在前 2 个 epoch 急剧下降后平稳收敛，没有出现震荡或发散，说明学习率与优化器设置合适。</w:t>
+        <w:rPr>
+          <w:rFonts w:ascii="Times New Roman" w:hAnsi="Times New Roman" w:eastAsia="宋体"/>
+          <w:b w:val="0"/>
+          <w:sz w:val="24"/>
+        </w:rPr>
+        <w:t>（2）收敛行为合理：损失在前 2 个 epoch 急剧下降后平稳收敛，没有出现震荡或发散，说明学习率与优化器设置合适。</w:t>
       </w:r>
     </w:p>
     <w:p>
       <w:pPr>
-        <w:pStyle w:val="ListBullet"/>
+        <w:spacing w:before="0" w:after="0" w:line="360" w:lineRule="auto"/>
+        <w:ind w:firstLine="480"/>
       </w:pPr>
       <w:r>
-        <w:t>编码器—解码器结构的作用：编码器把图像压缩到 64×7×7 的特征表示，迫使网络保留“数字结构”这类主要信息而丢弃随机噪声；解码器再据此重建干净图像，因此能起到去噪作用。</w:t>
+        <w:rPr>
+          <w:rFonts w:ascii="Times New Roman" w:hAnsi="Times New Roman" w:eastAsia="宋体"/>
+          <w:b w:val="0"/>
+          <w:sz w:val="24"/>
+        </w:rPr>
+        <w:t>（3）编码器—解码器结构的作用：编码器把图像压缩到 64×7×7 的特征表示，迫使网络保留“数字结构”这类主要信息而丢弃随机噪声；解码器再据此重建干净图像，因此能起到去噪作用。</w:t>
       </w:r>
     </w:p>
     <w:p>
       <w:pPr>
-        <w:pStyle w:val="ListBullet"/>
+        <w:spacing w:before="0" w:after="0" w:line="360" w:lineRule="auto"/>
+        <w:ind w:firstLine="480"/>
       </w:pPr>
       <w:r>
-        <w:t>可改进方向：增加训练轮数或加入跳跃连接（如 U-Net）可进一步提升 PSNR/SSIM；可尝试不同噪声类型（椒盐、泊松）做鲁棒性对比；使用 GPU 可显著缩短训练时间。</w:t>
+        <w:rPr>
+          <w:rFonts w:ascii="Times New Roman" w:hAnsi="Times New Roman" w:eastAsia="宋体"/>
+          <w:b w:val="0"/>
+          <w:sz w:val="24"/>
+        </w:rPr>
+        <w:t>（4）可改进方向：增加训练轮数或加入跳跃连接（如 U-Net）可进一步提升 PSNR/SSIM；可尝试不同噪声类型（椒盐、泊松）做鲁棒性对比；使用 GPU 可显著缩短训练时间。</w:t>
       </w:r>
     </w:p>
     <w:p>
       <w:pPr>
-        <w:pStyle w:val="Heading1"/>
+        <w:spacing w:before="120" w:after="120"/>
       </w:pPr>
       <w:r>
-        <w:t>六、结论</w:t>
+        <w:rPr>
+          <w:rFonts w:ascii="Times New Roman" w:hAnsi="Times New Roman" w:eastAsia="宋体"/>
+          <w:b/>
+          <w:sz w:val="28"/>
+        </w:rPr>
+        <w:t>6  小结</w:t>
       </w:r>
     </w:p>
     <w:p>
+      <w:pPr>
+        <w:spacing w:before="0" w:after="0" w:line="360" w:lineRule="auto"/>
+        <w:ind w:firstLine="480"/>
+      </w:pPr>
       <w:r>
+        <w:rPr>
+          <w:rFonts w:ascii="Times New Roman" w:hAnsi="Times New Roman" w:eastAsia="宋体"/>
+          <w:b w:val="0"/>
+          <w:sz w:val="24"/>
+        </w:rPr>
         <w:t>本实验基于 PyTorch 搭建了卷积去噪自编码器，对叠加高斯噪声的 MNIST 手写数字图像进行去噪。实验结果表明，该卷积神经网络能够有效去除图像噪声：测试集 PSNR 从 9.38 dB 提升至 19.48 dB，SSIM 达 0.83，去噪图像在视觉上清晰地恢复了原始数字。实验验证了卷积神经网络（编码器—解码器结构）在图像去噪任务中的有效性，也加深了对 PyTorch 框架与 CNN 训练流程的理解。</w:t>
       </w:r>
     </w:p>
@@ -1382,8 +2235,8 @@
     <w:qFormat/>
     <w:rsid w:val="00FC693F"/>
     <w:rPr>
-      <w:rFonts w:ascii="Microsoft YaHei" w:hAnsi="Microsoft YaHei"/>
-      <w:sz w:val="22"/>
+      <w:rFonts w:ascii="Times New Roman" w:hAnsi="Times New Roman" w:eastAsia="宋体"/>
+      <w:sz w:val="24"/>
     </w:rPr>
   </w:style>
   <w:style w:type="paragraph" w:styleId="Header">

</xml_diff>